<commit_message>
Fix resume: remove subtitle, shorten link text, align dates
Co-Authored-By: Claude Fable 5 <noreply@anthropic.com>
</commit_message>
<xml_diff>
--- a/assets/Rahul-Rawat-Resume.docx
+++ b/assets/Rahul-Rawat-Resume.docx
@@ -22,23 +22,6 @@
     </w:p>
     <w:p>
       <w:pPr>
-        <w:spacing w:after="90"/>
-        <w:jc w:val="center"/>
-      </w:pPr>
-      <w:r>
-        <w:rPr>
-          <w:rFonts w:ascii="Arial" w:cs="Arial" w:eastAsia="Arial" w:hAnsi="Arial"/>
-          <w:b/>
-          <w:bCs/>
-          <w:color w:val="0B57D0"/>
-          <w:sz w:val="22"/>
-          <w:szCs w:val="22"/>
-        </w:rPr>
-        <w:t xml:space="preserve">iOS &amp; Mobile Developer</w:t>
-      </w:r>
-    </w:p>
-    <w:p>
-      <w:pPr>
         <w:spacing w:after="200"/>
         <w:jc w:val="center"/>
       </w:pPr>
@@ -51,7 +34,7 @@
         </w:rPr>
         <w:t xml:space="preserve">Toronto, ON, Canada  |  226-700-9001  |  </w:t>
       </w:r>
-      <w:hyperlink w:history="1" r:id="rIdnpdlg2frutsnx1kgph1up">
+      <w:hyperlink w:history="1" r:id="rId9_a3vnyibmf9rjtq0r5_c">
         <w:r>
           <w:rPr>
             <w:rFonts w:ascii="Arial" w:cs="Arial" w:eastAsia="Arial" w:hAnsi="Arial"/>
@@ -71,7 +54,7 @@
         </w:rPr>
         <w:t xml:space="preserve">  |  </w:t>
       </w:r>
-      <w:hyperlink w:history="1" r:id="rId9gb89kfcrvqfuqcaczozb">
+      <w:hyperlink w:history="1" r:id="rId849hyu5a2w8ucpajj8ev0">
         <w:r>
           <w:rPr>
             <w:rFonts w:ascii="Arial" w:cs="Arial" w:eastAsia="Arial" w:hAnsi="Arial"/>
@@ -79,7 +62,7 @@
             <w:sz w:val="18"/>
             <w:szCs w:val="18"/>
           </w:rPr>
-          <w:t xml:space="preserve">linkedin.com/in/rahul-rawat-abb160151</w:t>
+          <w:t xml:space="preserve">LinkedIn</w:t>
         </w:r>
       </w:hyperlink>
       <w:r>
@@ -91,7 +74,7 @@
         </w:rPr>
         <w:t xml:space="preserve">  |  </w:t>
       </w:r>
-      <w:hyperlink w:history="1" r:id="rIdcbvovqlfmm2ae1xnbg4n3">
+      <w:hyperlink w:history="1" r:id="rId6yxbv0i2kdyd3-x72ay9b">
         <w:r>
           <w:rPr>
             <w:rFonts w:ascii="Arial" w:cs="Arial" w:eastAsia="Arial" w:hAnsi="Arial"/>
@@ -99,7 +82,7 @@
             <w:sz w:val="18"/>
             <w:szCs w:val="18"/>
           </w:rPr>
-          <w:t xml:space="preserve">github.com/rahulrawatofficial</w:t>
+          <w:t xml:space="preserve">GitHub</w:t>
         </w:r>
       </w:hyperlink>
     </w:p>
@@ -305,7 +288,7 @@
     <w:p>
       <w:pPr>
         <w:tabs>
-          <w:tab w:val="right" w:pos="9026"/>
+          <w:tab w:val="right" w:pos="10800"/>
         </w:tabs>
         <w:spacing w:after="0" w:before="60"/>
       </w:pPr>
@@ -429,7 +412,7 @@
     <w:p>
       <w:pPr>
         <w:tabs>
-          <w:tab w:val="right" w:pos="9026"/>
+          <w:tab w:val="right" w:pos="10800"/>
         </w:tabs>
         <w:spacing w:after="0" w:before="60"/>
       </w:pPr>
@@ -496,7 +479,7 @@
     <w:p>
       <w:pPr>
         <w:tabs>
-          <w:tab w:val="right" w:pos="9026"/>
+          <w:tab w:val="right" w:pos="10800"/>
         </w:tabs>
         <w:spacing w:after="0" w:before="60"/>
       </w:pPr>
@@ -621,7 +604,7 @@
     <w:p>
       <w:pPr>
         <w:tabs>
-          <w:tab w:val="right" w:pos="9026"/>
+          <w:tab w:val="right" w:pos="10800"/>
         </w:tabs>
         <w:spacing w:after="0" w:before="60"/>
       </w:pPr>
@@ -665,7 +648,7 @@
     <w:p>
       <w:pPr>
         <w:tabs>
-          <w:tab w:val="right" w:pos="9026"/>
+          <w:tab w:val="right" w:pos="10800"/>
         </w:tabs>
         <w:spacing w:after="0" w:before="60"/>
       </w:pPr>
@@ -754,7 +737,7 @@
     <w:p>
       <w:pPr>
         <w:tabs>
-          <w:tab w:val="right" w:pos="9026"/>
+          <w:tab w:val="right" w:pos="10800"/>
         </w:tabs>
         <w:spacing w:after="20"/>
       </w:pPr>
@@ -800,7 +783,7 @@
     <w:p>
       <w:pPr>
         <w:tabs>
-          <w:tab w:val="right" w:pos="9026"/>
+          <w:tab w:val="right" w:pos="10800"/>
         </w:tabs>
         <w:spacing w:after="20"/>
       </w:pPr>

</xml_diff>